<commit_message>
Update the Oct 11 script with The Witness date from the flyer.
Co-authored-by: Cursor <cursoragent@cursor.com>
</commit_message>
<xml_diff>
--- a/scripts/Announcement-Script-2026-10-11.docx
+++ b/scripts/Announcement-Script-2026-10-11.docx
@@ -370,7 +370,7 @@
           <w:color w:val="C00000"/>
           <w:sz w:val="22"/>
         </w:rPr>
-        <w:t>Monday, October 26th at 5:00 PM</w:t>
+        <w:t>Sunday, October 25th at 5:00 PM</w:t>
       </w:r>
       <w:r>
         <w:rPr>
@@ -388,7 +388,7 @@
           <w:color w:val="C00000"/>
           <w:sz w:val="22"/>
         </w:rPr>
-        <w:t>T&amp;T Park Event Centre, Sangotedo</w:t>
+        <w:t>T&amp;T Parkwest Event Centre, Sangotedo</w:t>
       </w:r>
       <w:r>
         <w:rPr>

</xml_diff>